<commit_message>
feat(footer): NovaMóvil footer scoped under .footer-novamovil
- footer.js adds .footer-novamovil and builds brand column (logo +
  wordmark + tagline), link columns (heading + list) and bottom row
  (copyright + payment chips) from the three footer document sections,
  tolerating missing sections or a missing document
- footer.css: native nesting inside .footer-novamovil, each part with
  its media query below; one column on mobile, four from 768px
- Colours from styles/colors.css: new --footer-* and shared
  --brand-logo-* tokens, plus --color-gray-300 measured from the design
- Brand logic moved to scripts/brand.js and shared by header and footer
- content-drive/footer.docx updated to Productos / Soporte / Legal,
  copyright and payment methods

Co-Authored-By: Claude Opus 5.5 (1M context) <noreply@anthropic.com>
</commit_message>
<xml_diff>
--- a/content-drive/footer.docx
+++ b/content-drive/footer.docx
@@ -3,23 +3,19 @@
 <w:document xmlns:w="http://schemas.openxmlformats.org/wordprocessingml/2006/main" xmlns:r="http://schemas.openxmlformats.org/officeDocument/2006/relationships">
   <w:body>
     <w:p>
-      <w:r>
-        <w:rPr>
-          <w:b/>
-        </w:rPr>
-        <w:t xml:space="preserve">Nova</w:t>
-      </w:r>
-      <w:r>
-        <w:rPr>
-          <w:b/>
-          <w:i/>
-        </w:rPr>
-        <w:t xml:space="preserve">Móvil</w:t>
-      </w:r>
-    </w:p>
-    <w:p>
-      <w:r>
-        <w:t xml:space="preserve">Tu tienda de celulares, planes y accesorios.</w:t>
+      <w:hyperlink r:id="rIdL1">
+        <w:r>
+          <w:rPr>
+            <w:color w:val="1155CC"/>
+            <w:u w:val="single"/>
+          </w:rPr>
+          <w:t xml:space="preserve">:logo: NovaMóvil</w:t>
+        </w:r>
+      </w:hyperlink>
+    </w:p>
+    <w:p>
+      <w:r>
+        <w:t xml:space="preserve">La mejor experiencia en telefonía móvil para México. Conecta con lo que importa.</w:t>
       </w:r>
     </w:p>
     <w:p>
@@ -32,7 +28,7 @@
         <w:pStyle w:val="Heading3"/>
       </w:pPr>
       <w:r>
-        <w:t xml:space="preserve">Tienda</w:t>
+        <w:t xml:space="preserve">Productos</w:t>
       </w:r>
     </w:p>
     <w:p>
@@ -42,7 +38,7 @@
           <w:numId w:val="1"/>
         </w:numPr>
       </w:pPr>
-      <w:hyperlink r:id="rIdL1">
+      <w:hyperlink r:id="rIdL2">
         <w:r>
           <w:rPr>
             <w:color w:val="1155CC"/>
@@ -59,7 +55,7 @@
           <w:numId w:val="1"/>
         </w:numPr>
       </w:pPr>
-      <w:hyperlink r:id="rIdL2">
+      <w:hyperlink r:id="rIdL3">
         <w:r>
           <w:rPr>
             <w:color w:val="1155CC"/>
@@ -76,7 +72,7 @@
           <w:numId w:val="1"/>
         </w:numPr>
       </w:pPr>
-      <w:hyperlink r:id="rIdL3">
+      <w:hyperlink r:id="rIdL4">
         <w:r>
           <w:rPr>
             <w:color w:val="1155CC"/>
@@ -93,7 +89,7 @@
           <w:numId w:val="1"/>
         </w:numPr>
       </w:pPr>
-      <w:hyperlink r:id="rIdL4">
+      <w:hyperlink r:id="rIdL5">
         <w:r>
           <w:rPr>
             <w:color w:val="1155CC"/>
@@ -108,7 +104,7 @@
         <w:pStyle w:val="Heading3"/>
       </w:pPr>
       <w:r>
-        <w:t xml:space="preserve">Ayuda</w:t>
+        <w:t xml:space="preserve">Soporte</w:t>
       </w:r>
     </w:p>
     <w:p>
@@ -118,13 +114,13 @@
           <w:numId w:val="2"/>
         </w:numPr>
       </w:pPr>
-      <w:hyperlink r:id="rIdL5">
-        <w:r>
-          <w:rPr>
-            <w:color w:val="1155CC"/>
-            <w:u w:val="single"/>
-          </w:rPr>
-          <w:t xml:space="preserve">Mi cuenta</w:t>
+      <w:hyperlink r:id="rIdL6">
+        <w:r>
+          <w:rPr>
+            <w:color w:val="1155CC"/>
+            <w:u w:val="single"/>
+          </w:rPr>
+          <w:t xml:space="preserve">Centro de ayuda</w:t>
         </w:r>
       </w:hyperlink>
     </w:p>
@@ -135,13 +131,13 @@
           <w:numId w:val="2"/>
         </w:numPr>
       </w:pPr>
-      <w:hyperlink r:id="rIdL6">
-        <w:r>
-          <w:rPr>
-            <w:color w:val="1155CC"/>
-            <w:u w:val="single"/>
-          </w:rPr>
-          <w:t xml:space="preserve">Carrito</w:t>
+      <w:hyperlink r:id="rIdL7">
+        <w:r>
+          <w:rPr>
+            <w:color w:val="1155CC"/>
+            <w:u w:val="single"/>
+          </w:rPr>
+          <w:t xml:space="preserve">Chat en línea</w:t>
         </w:r>
       </w:hyperlink>
     </w:p>
@@ -152,13 +148,30 @@
           <w:numId w:val="2"/>
         </w:numPr>
       </w:pPr>
-      <w:hyperlink r:id="rIdL7">
-        <w:r>
-          <w:rPr>
-            <w:color w:val="1155CC"/>
-            <w:u w:val="single"/>
-          </w:rPr>
-          <w:t xml:space="preserve">Contacto</w:t>
+      <w:hyperlink r:id="rIdL8">
+        <w:r>
+          <w:rPr>
+            <w:color w:val="1155CC"/>
+            <w:u w:val="single"/>
+          </w:rPr>
+          <w:t xml:space="preserve">Tiendas</w:t>
+        </w:r>
+      </w:hyperlink>
+    </w:p>
+    <w:p>
+      <w:pPr>
+        <w:numPr>
+          <w:ilvl w:val="0"/>
+          <w:numId w:val="2"/>
+        </w:numPr>
+      </w:pPr>
+      <w:hyperlink r:id="rIdL9">
+        <w:r>
+          <w:rPr>
+            <w:color w:val="1155CC"/>
+            <w:u w:val="single"/>
+          </w:rPr>
+          <w:t xml:space="preserve">Rastrear pedido</w:t>
         </w:r>
       </w:hyperlink>
     </w:p>
@@ -177,7 +190,7 @@
           <w:numId w:val="3"/>
         </w:numPr>
       </w:pPr>
-      <w:hyperlink r:id="rIdL8">
+      <w:hyperlink r:id="rIdL10">
         <w:r>
           <w:rPr>
             <w:color w:val="1155CC"/>
@@ -194,7 +207,7 @@
           <w:numId w:val="3"/>
         </w:numPr>
       </w:pPr>
-      <w:hyperlink r:id="rIdL9">
+      <w:hyperlink r:id="rIdL11">
         <w:r>
           <w:rPr>
             <w:color w:val="1155CC"/>
@@ -205,13 +218,91 @@
       </w:hyperlink>
     </w:p>
     <w:p>
+      <w:pPr>
+        <w:numPr>
+          <w:ilvl w:val="0"/>
+          <w:numId w:val="3"/>
+        </w:numPr>
+      </w:pPr>
+      <w:hyperlink r:id="rIdL12">
+        <w:r>
+          <w:rPr>
+            <w:color w:val="1155CC"/>
+            <w:u w:val="single"/>
+          </w:rPr>
+          <w:t xml:space="preserve">Políticas de devolución</w:t>
+        </w:r>
+      </w:hyperlink>
+    </w:p>
+    <w:p>
+      <w:pPr>
+        <w:numPr>
+          <w:ilvl w:val="0"/>
+          <w:numId w:val="3"/>
+        </w:numPr>
+      </w:pPr>
+      <w:hyperlink r:id="rIdL13">
+        <w:r>
+          <w:rPr>
+            <w:color w:val="1155CC"/>
+            <w:u w:val="single"/>
+          </w:rPr>
+          <w:t xml:space="preserve">Cookies</w:t>
+        </w:r>
+      </w:hyperlink>
+    </w:p>
+    <w:p>
       <w:r>
         <w:t xml:space="preserve">---</w:t>
       </w:r>
     </w:p>
     <w:p>
       <w:r>
-        <w:t xml:space="preserve">© 2026 NovaMóvil. Todos los derechos reservados.</w:t>
+        <w:t xml:space="preserve">© 2026 NovaMóvil S.A. de C.V. Todos los derechos reservados.</w:t>
+      </w:r>
+    </w:p>
+    <w:p>
+      <w:pPr>
+        <w:numPr>
+          <w:ilvl w:val="0"/>
+          <w:numId w:val="4"/>
+        </w:numPr>
+      </w:pPr>
+      <w:r>
+        <w:t xml:space="preserve">VISA</w:t>
+      </w:r>
+    </w:p>
+    <w:p>
+      <w:pPr>
+        <w:numPr>
+          <w:ilvl w:val="0"/>
+          <w:numId w:val="4"/>
+        </w:numPr>
+      </w:pPr>
+      <w:r>
+        <w:t xml:space="preserve">MC</w:t>
+      </w:r>
+    </w:p>
+    <w:p>
+      <w:pPr>
+        <w:numPr>
+          <w:ilvl w:val="0"/>
+          <w:numId w:val="4"/>
+        </w:numPr>
+      </w:pPr>
+      <w:r>
+        <w:t xml:space="preserve">PAYPAL</w:t>
+      </w:r>
+    </w:p>
+    <w:p>
+      <w:pPr>
+        <w:numPr>
+          <w:ilvl w:val="0"/>
+          <w:numId w:val="4"/>
+        </w:numPr>
+      </w:pPr>
+      <w:r>
+        <w:t xml:space="preserve">OXXO</w:t>
       </w:r>
     </w:p>
     <w:sectPr/>

</xml_diff>

<commit_message>
docs(content-drive): regenerate the Drive documents with the current structure
- index.docx: home; Card Featured Product Link /celulares/?sku={sku}
- celulares.docx: breadcrumb + Product Catalog; Product Link /celulares/?sku={sku}
- celulares/index.docx: breadcrumb (Level 3 {product}) + Product Detail, no Preview Sku or
  alert rows, empty list texts "Este celular no existe"
- footer.docx regenerated (same content)

Co-Authored-By: Claude Opus 5.5 (1M context) <noreply@anthropic.com>
</commit_message>
<xml_diff>
--- a/content-drive/footer.docx
+++ b/content-drive/footer.docx
@@ -1,6 +1,6 @@
 
 <file path=word/document.xml><?xml version="1.0" encoding="utf-8"?>
-<w:document xmlns:w="http://schemas.openxmlformats.org/wordprocessingml/2006/main" xmlns:r="http://schemas.openxmlformats.org/officeDocument/2006/relationships">
+<w:document xmlns:w="http://schemas.openxmlformats.org/wordprocessingml/2006/main" xmlns:r="http://schemas.openxmlformats.org/officeDocument/2006/relationships" xmlns:wp="http://schemas.openxmlformats.org/drawingml/2006/wordprocessingDrawing" xmlns:a="http://schemas.openxmlformats.org/drawingml/2006/main" xmlns:pic="http://schemas.openxmlformats.org/drawingml/2006/picture">
   <w:body>
     <w:p>
       <w:hyperlink r:id="rIdL1">
@@ -305,13 +305,16 @@
         <w:t xml:space="preserve">OXXO</w:t>
       </w:r>
     </w:p>
-    <w:sectPr/>
+    <w:sectPr>
+      <w:pgSz w:w="12240" w:h="15840"/>
+      <w:pgMar w:top="1440" w:right="1440" w:bottom="1440" w:left="1440" w:header="720" w:footer="720" w:gutter="0"/>
+    </w:sectPr>
   </w:body>
 </w:document>
 </file>
 
 <file path=word/numbering.xml><?xml version="1.0" encoding="utf-8"?>
-<w:numbering xmlns:w="http://schemas.openxmlformats.org/wordprocessingml/2006/main" xmlns:r="http://schemas.openxmlformats.org/officeDocument/2006/relationships">
+<w:numbering xmlns:w="http://schemas.openxmlformats.org/wordprocessingml/2006/main" xmlns:r="http://schemas.openxmlformats.org/officeDocument/2006/relationships" xmlns:wp="http://schemas.openxmlformats.org/drawingml/2006/wordprocessingDrawing" xmlns:a="http://schemas.openxmlformats.org/drawingml/2006/main" xmlns:pic="http://schemas.openxmlformats.org/drawingml/2006/picture">
   <w:abstractNum w:abstractNumId="0">
     <w:lvl w:ilvl="0">
       <w:start w:val="1"/>
@@ -354,7 +357,7 @@
 </file>
 
 <file path=word/styles.xml><?xml version="1.0" encoding="utf-8"?>
-<w:styles xmlns:w="http://schemas.openxmlformats.org/wordprocessingml/2006/main" xmlns:r="http://schemas.openxmlformats.org/officeDocument/2006/relationships">
+<w:styles xmlns:w="http://schemas.openxmlformats.org/wordprocessingml/2006/main" xmlns:r="http://schemas.openxmlformats.org/officeDocument/2006/relationships" xmlns:wp="http://schemas.openxmlformats.org/drawingml/2006/wordprocessingDrawing" xmlns:a="http://schemas.openxmlformats.org/drawingml/2006/main" xmlns:pic="http://schemas.openxmlformats.org/drawingml/2006/picture">
   <w:style w:type="paragraph" w:default="1" w:styleId="Normal">
     <w:name w:val="Normal"/>
     <w:qFormat/>

</xml_diff>